<commit_message>
định mức + cấu hình lệnh
Co-authored-by: Cursor <cursoragent@cursor.com>
</commit_message>
<xml_diff>
--- a/templates/stage-orders/xa.docx
+++ b/templates/stage-orders/xa.docx
@@ -110,26 +110,6 @@
           <w:lang w:val="de-DE"/>
         </w:rPr>
         <w:tab/>
-        <w:t xml:space="preserve">2. Kích thước xả:         </w:t>
-      </w:r>
-    </w:p>
-    <w:p>
-      <w:pPr>
-        <w:rPr>
-          <w:rFonts w:ascii="Times New Roman" w:hAnsi="Times New Roman"/>
-          <w:sz w:val="24"/>
-          <w:szCs w:val="24"/>
-          <w:lang w:val="de-DE"/>
-        </w:rPr>
-      </w:pPr>
-      <w:r>
-        <w:rPr>
-          <w:rFonts w:ascii="Times New Roman" w:hAnsi="Times New Roman"/>
-          <w:sz w:val="24"/>
-          <w:szCs w:val="24"/>
-          <w:lang w:val="de-DE"/>
-        </w:rPr>
-        <w:t>3. Định lượng xuất:</w:t>
       </w:r>
       <w:r>
         <w:rPr>
@@ -138,9 +118,19 @@
           <w:szCs w:val="24"/>
           <w:lang w:val="de-DE"/>
         </w:rPr>
-        <w:tab/>
-        <w:t xml:space="preserve"> </w:t>
+        <w:t>6. Khối lượng</w:t>
       </w:r>
+    </w:p>
+    <w:p>
+      <w:pPr>
+        <w:spacing w:before="120"/>
+        <w:rPr>
+          <w:rFonts w:ascii="Times New Roman" w:hAnsi="Times New Roman"/>
+          <w:sz w:val="24"/>
+          <w:szCs w:val="24"/>
+          <w:lang w:val="de-DE"/>
+        </w:rPr>
+      </w:pPr>
       <w:r>
         <w:rPr>
           <w:rFonts w:ascii="Times New Roman" w:hAnsi="Times New Roman"/>
@@ -148,161 +138,7 @@
           <w:szCs w:val="24"/>
           <w:lang w:val="de-DE"/>
         </w:rPr>
-        <w:tab/>
-        <w:t xml:space="preserve">                                                       </w:t>
-      </w:r>
-      <w:r>
-        <w:rPr>
-          <w:rFonts w:ascii="Times New Roman" w:hAnsi="Times New Roman"/>
-          <w:sz w:val="24"/>
-          <w:szCs w:val="24"/>
-          <w:lang w:val="de-DE"/>
-        </w:rPr>
-        <w:tab/>
-      </w:r>
-      <w:r>
-        <w:rPr>
-          <w:rFonts w:ascii="Times New Roman" w:hAnsi="Times New Roman"/>
-          <w:sz w:val="24"/>
-          <w:szCs w:val="24"/>
-          <w:lang w:val="vi-VN"/>
-        </w:rPr>
-        <w:t>4. Khối</w:t>
-      </w:r>
-      <w:r>
-        <w:rPr>
-          <w:rFonts w:ascii="Times New Roman" w:hAnsi="Times New Roman"/>
-          <w:sz w:val="24"/>
-          <w:szCs w:val="24"/>
-          <w:lang w:val="de-DE"/>
-        </w:rPr>
-        <w:t xml:space="preserve"> lượng </w:t>
-      </w:r>
-      <w:r>
-        <w:rPr>
-          <w:rFonts w:ascii="Times New Roman" w:hAnsi="Times New Roman"/>
-          <w:b/>
-          <w:i/>
-          <w:sz w:val="24"/>
-          <w:szCs w:val="24"/>
-          <w:lang w:val="de-DE"/>
-        </w:rPr>
-        <w:t xml:space="preserve">:            </w:t>
-      </w:r>
-    </w:p>
-    <w:p>
-      <w:pPr>
-        <w:spacing w:after="60"/>
-        <w:rPr>
-          <w:rFonts w:ascii="Times New Roman" w:hAnsi="Times New Roman"/>
-          <w:b/>
-          <w:i/>
-          <w:sz w:val="24"/>
-          <w:szCs w:val="24"/>
-        </w:rPr>
-      </w:pPr>
-      <w:r>
-        <w:rPr>
-          <w:rFonts w:ascii="Times New Roman" w:hAnsi="Times New Roman"/>
-          <w:sz w:val="24"/>
-          <w:szCs w:val="24"/>
-          <w:lang w:val="de-DE"/>
-        </w:rPr>
-        <w:t xml:space="preserve">5. Số lệnh:                    </w:t>
-      </w:r>
-      <w:r>
-        <w:rPr>
-          <w:rFonts w:ascii="Times New Roman" w:hAnsi="Times New Roman"/>
-          <w:b/>
-          <w:i/>
-          <w:sz w:val="24"/>
-          <w:szCs w:val="24"/>
-          <w:lang w:val="de-DE"/>
-        </w:rPr>
-        <w:tab/>
-      </w:r>
-      <w:r>
-        <w:rPr>
-          <w:rFonts w:ascii="Times New Roman" w:hAnsi="Times New Roman"/>
-          <w:b/>
-          <w:i/>
-          <w:sz w:val="24"/>
-          <w:szCs w:val="24"/>
-          <w:lang w:val="de-DE"/>
-        </w:rPr>
-        <w:tab/>
-      </w:r>
-      <w:r>
-        <w:rPr>
-          <w:rFonts w:ascii="Times New Roman" w:hAnsi="Times New Roman"/>
-          <w:b/>
-          <w:i/>
-          <w:sz w:val="24"/>
-          <w:szCs w:val="24"/>
-          <w:lang w:val="de-DE"/>
-        </w:rPr>
-        <w:tab/>
-      </w:r>
-      <w:r>
-        <w:rPr>
-          <w:rFonts w:ascii="Times New Roman" w:hAnsi="Times New Roman"/>
-          <w:b/>
-          <w:i/>
-          <w:sz w:val="24"/>
-          <w:szCs w:val="24"/>
-          <w:lang w:val="de-DE"/>
-        </w:rPr>
-        <w:tab/>
-      </w:r>
-      <w:r>
-        <w:rPr>
-          <w:rFonts w:ascii="Times New Roman" w:hAnsi="Times New Roman"/>
-          <w:b/>
-          <w:i/>
-          <w:sz w:val="24"/>
-          <w:szCs w:val="24"/>
-          <w:lang w:val="de-DE"/>
-        </w:rPr>
-        <w:tab/>
-      </w:r>
-      <w:r>
-        <w:rPr>
-          <w:rFonts w:ascii="Times New Roman" w:hAnsi="Times New Roman"/>
-          <w:b/>
-          <w:i/>
-          <w:sz w:val="24"/>
-          <w:szCs w:val="24"/>
-          <w:lang w:val="de-DE"/>
-        </w:rPr>
-        <w:tab/>
-      </w:r>
-      <w:r>
-        <w:rPr>
-          <w:rFonts w:ascii="Times New Roman" w:hAnsi="Times New Roman"/>
-          <w:sz w:val="24"/>
-          <w:szCs w:val="24"/>
-          <w:lang w:val="de-DE"/>
-        </w:rPr>
-        <w:t xml:space="preserve">6. Ngày đưa lệnh          </w:t>
-      </w:r>
-    </w:p>
-    <w:p>
-      <w:pPr>
-        <w:rPr>
-          <w:rFonts w:ascii="Times New Roman" w:hAnsi="Times New Roman"/>
-          <w:sz w:val="24"/>
-          <w:szCs w:val="24"/>
-          <w:lang w:val="de-DE"/>
-        </w:rPr>
-      </w:pPr>
-      <w:r>
-        <w:rPr>
-          <w:rFonts w:ascii="Times New Roman" w:hAnsi="Times New Roman"/>
-          <w:sz w:val="24"/>
-          <w:szCs w:val="24"/>
-          <w:lang w:val="de-DE"/>
-        </w:rPr>
-        <w:t xml:space="preserve">7. Ngày hoàn thành:      </w:t>
+        <w:t xml:space="preserve">2. Kích thước xả:         </w:t>
       </w:r>
       <w:r>
         <w:rPr>
@@ -357,7 +193,368 @@
           <w:lang w:val="de-DE"/>
         </w:rPr>
         <w:tab/>
-        <w:t xml:space="preserve">8. Ghi chú:  </w:t>
+        <w:t xml:space="preserve">7. Số quả: </w:t>
+      </w:r>
+      <w:r>
+        <w:rPr>
+          <w:rFonts w:ascii="Times New Roman" w:hAnsi="Times New Roman"/>
+          <w:sz w:val="24"/>
+          <w:szCs w:val="24"/>
+          <w:lang w:val="de-DE"/>
+        </w:rPr>
+        <w:tab/>
+      </w:r>
+      <w:r>
+        <w:rPr>
+          <w:rFonts w:ascii="Times New Roman" w:hAnsi="Times New Roman"/>
+          <w:sz w:val="24"/>
+          <w:szCs w:val="24"/>
+          <w:lang w:val="de-DE"/>
+        </w:rPr>
+        <w:tab/>
+        <w:t>-Trọng lượng /quả: 951</w:t>
+      </w:r>
+    </w:p>
+    <w:p>
+      <w:pPr>
+        <w:rPr>
+          <w:rFonts w:ascii="Times New Roman" w:hAnsi="Times New Roman"/>
+          <w:sz w:val="24"/>
+          <w:szCs w:val="24"/>
+          <w:lang w:val="de-DE"/>
+        </w:rPr>
+      </w:pPr>
+      <w:r>
+        <w:rPr>
+          <w:rFonts w:ascii="Times New Roman" w:hAnsi="Times New Roman"/>
+          <w:sz w:val="24"/>
+          <w:szCs w:val="24"/>
+          <w:lang w:val="de-DE"/>
+        </w:rPr>
+        <w:t>3. Định lượng xuất:</w:t>
+      </w:r>
+      <w:r>
+        <w:rPr>
+          <w:rFonts w:ascii="Times New Roman" w:hAnsi="Times New Roman"/>
+          <w:sz w:val="24"/>
+          <w:szCs w:val="24"/>
+          <w:lang w:val="de-DE"/>
+        </w:rPr>
+        <w:tab/>
+        <w:t xml:space="preserve"> </w:t>
+      </w:r>
+      <w:r>
+        <w:rPr>
+          <w:rFonts w:ascii="Times New Roman" w:hAnsi="Times New Roman"/>
+          <w:sz w:val="24"/>
+          <w:szCs w:val="24"/>
+          <w:lang w:val="de-DE"/>
+        </w:rPr>
+        <w:tab/>
+        <w:t xml:space="preserve">                                                       </w:t>
+      </w:r>
+      <w:r>
+        <w:rPr>
+          <w:rFonts w:ascii="Times New Roman" w:hAnsi="Times New Roman"/>
+          <w:sz w:val="24"/>
+          <w:szCs w:val="24"/>
+          <w:lang w:val="de-DE"/>
+        </w:rPr>
+        <w:tab/>
+      </w:r>
+      <w:r>
+        <w:rPr>
+          <w:rFonts w:ascii="Times New Roman" w:hAnsi="Times New Roman"/>
+          <w:sz w:val="24"/>
+          <w:szCs w:val="24"/>
+        </w:rPr>
+        <w:t>8</w:t>
+      </w:r>
+      <w:r>
+        <w:rPr>
+          <w:rFonts w:ascii="Times New Roman" w:hAnsi="Times New Roman"/>
+          <w:sz w:val="24"/>
+          <w:szCs w:val="24"/>
+          <w:lang w:val="vi-VN"/>
+        </w:rPr>
+        <w:t>.</w:t>
+      </w:r>
+      <w:r>
+        <w:rPr>
+          <w:rFonts w:ascii="Times New Roman" w:hAnsi="Times New Roman"/>
+          <w:sz w:val="24"/>
+          <w:szCs w:val="24"/>
+        </w:rPr>
+        <w:t xml:space="preserve"> Số lượng tương ứng</w:t>
+      </w:r>
+      <w:r>
+        <w:rPr>
+          <w:rFonts w:ascii="Times New Roman" w:hAnsi="Times New Roman"/>
+          <w:b/>
+          <w:i/>
+          <w:sz w:val="24"/>
+          <w:szCs w:val="24"/>
+          <w:lang w:val="de-DE"/>
+        </w:rPr>
+        <w:t xml:space="preserve">:    </w:t>
+      </w:r>
+      <w:r>
+        <w:rPr>
+          <w:rFonts w:ascii="Times New Roman" w:hAnsi="Times New Roman"/>
+          <w:b/>
+          <w:i/>
+          <w:sz w:val="24"/>
+          <w:szCs w:val="24"/>
+          <w:lang w:val="de-DE"/>
+        </w:rPr>
+        <w:tab/>
+        <w:t>Tờ</w:t>
+      </w:r>
+      <w:r>
+        <w:rPr>
+          <w:rFonts w:ascii="Times New Roman" w:hAnsi="Times New Roman"/>
+          <w:b/>
+          <w:i/>
+          <w:sz w:val="24"/>
+          <w:szCs w:val="24"/>
+          <w:lang w:val="de-DE"/>
+        </w:rPr>
+        <w:t xml:space="preserve">        </w:t>
+      </w:r>
+      <w:r>
+        <w:rPr>
+          <w:rFonts w:ascii="Times New Roman" w:hAnsi="Times New Roman"/>
+          <w:b/>
+          <w:i/>
+          <w:sz w:val="24"/>
+          <w:szCs w:val="24"/>
+          <w:lang w:val="de-DE"/>
+        </w:rPr>
+        <w:tab/>
+      </w:r>
+      <w:r>
+        <w:rPr>
+          <w:rFonts w:ascii="Times New Roman" w:hAnsi="Times New Roman"/>
+          <w:b/>
+          <w:i/>
+          <w:sz w:val="24"/>
+          <w:szCs w:val="24"/>
+          <w:lang w:val="de-DE"/>
+        </w:rPr>
+        <w:tab/>
+      </w:r>
+      <w:r>
+        <w:rPr>
+          <w:rFonts w:ascii="Times New Roman" w:hAnsi="Times New Roman"/>
+          <w:b/>
+          <w:i/>
+          <w:sz w:val="24"/>
+          <w:szCs w:val="24"/>
+          <w:lang w:val="de-DE"/>
+        </w:rPr>
+        <w:tab/>
+      </w:r>
+      <w:r>
+        <w:rPr>
+          <w:rFonts w:ascii="Times New Roman" w:hAnsi="Times New Roman"/>
+          <w:b/>
+          <w:i/>
+          <w:sz w:val="24"/>
+          <w:szCs w:val="24"/>
+          <w:lang w:val="de-DE"/>
+        </w:rPr>
+        <w:tab/>
+      </w:r>
+    </w:p>
+    <w:p>
+      <w:pPr>
+        <w:spacing w:after="60"/>
+        <w:rPr>
+          <w:rFonts w:ascii="Times New Roman" w:hAnsi="Times New Roman"/>
+          <w:sz w:val="24"/>
+          <w:szCs w:val="24"/>
+          <w:lang w:val="de-DE"/>
+        </w:rPr>
+      </w:pPr>
+      <w:r>
+        <w:rPr>
+          <w:rFonts w:ascii="Times New Roman" w:hAnsi="Times New Roman"/>
+          <w:sz w:val="24"/>
+          <w:szCs w:val="24"/>
+          <w:lang w:val="de-DE"/>
+        </w:rPr>
+        <w:t>4</w:t>
+      </w:r>
+      <w:r>
+        <w:rPr>
+          <w:rFonts w:ascii="Times New Roman" w:hAnsi="Times New Roman"/>
+          <w:sz w:val="24"/>
+          <w:szCs w:val="24"/>
+          <w:lang w:val="de-DE"/>
+        </w:rPr>
+        <w:t xml:space="preserve">. Ngày đưa lệnh          </w:t>
+      </w:r>
+      <w:r>
+        <w:rPr>
+          <w:rFonts w:ascii="Times New Roman" w:hAnsi="Times New Roman"/>
+          <w:sz w:val="24"/>
+          <w:szCs w:val="24"/>
+          <w:lang w:val="de-DE"/>
+        </w:rPr>
+        <w:tab/>
+      </w:r>
+      <w:r>
+        <w:rPr>
+          <w:rFonts w:ascii="Times New Roman" w:hAnsi="Times New Roman"/>
+          <w:sz w:val="24"/>
+          <w:szCs w:val="24"/>
+          <w:lang w:val="de-DE"/>
+        </w:rPr>
+        <w:tab/>
+      </w:r>
+      <w:r>
+        <w:rPr>
+          <w:rFonts w:ascii="Times New Roman" w:hAnsi="Times New Roman"/>
+          <w:sz w:val="24"/>
+          <w:szCs w:val="24"/>
+          <w:lang w:val="de-DE"/>
+        </w:rPr>
+        <w:tab/>
+      </w:r>
+      <w:r>
+        <w:rPr>
+          <w:rFonts w:ascii="Times New Roman" w:hAnsi="Times New Roman"/>
+          <w:sz w:val="24"/>
+          <w:szCs w:val="24"/>
+          <w:lang w:val="de-DE"/>
+        </w:rPr>
+        <w:tab/>
+      </w:r>
+      <w:r>
+        <w:rPr>
+          <w:rFonts w:ascii="Times New Roman" w:hAnsi="Times New Roman"/>
+          <w:sz w:val="24"/>
+          <w:szCs w:val="24"/>
+          <w:lang w:val="de-DE"/>
+        </w:rPr>
+        <w:tab/>
+      </w:r>
+      <w:r>
+        <w:rPr>
+          <w:rFonts w:ascii="Times New Roman" w:hAnsi="Times New Roman"/>
+          <w:sz w:val="24"/>
+          <w:szCs w:val="24"/>
+          <w:lang w:val="de-DE"/>
+        </w:rPr>
+        <w:tab/>
+      </w:r>
+      <w:r>
+        <w:rPr>
+          <w:rFonts w:ascii="Times New Roman" w:hAnsi="Times New Roman"/>
+          <w:sz w:val="24"/>
+          <w:szCs w:val="24"/>
+          <w:lang w:val="de-DE"/>
+        </w:rPr>
+        <w:t xml:space="preserve">9.  Ngày hoàn thành:      </w:t>
+      </w:r>
+    </w:p>
+    <w:p>
+      <w:pPr>
+        <w:spacing w:after="60"/>
+        <w:rPr>
+          <w:rFonts w:ascii="Times New Roman" w:hAnsi="Times New Roman"/>
+          <w:b/>
+          <w:i/>
+          <w:sz w:val="24"/>
+          <w:szCs w:val="24"/>
+        </w:rPr>
+      </w:pPr>
+      <w:r>
+        <w:rPr>
+          <w:rFonts w:ascii="Times New Roman" w:hAnsi="Times New Roman"/>
+          <w:sz w:val="24"/>
+          <w:szCs w:val="24"/>
+          <w:lang w:val="de-DE"/>
+        </w:rPr>
+        <w:t xml:space="preserve">5. Số lệnh:                    </w:t>
+      </w:r>
+      <w:r>
+        <w:rPr>
+          <w:rFonts w:ascii="Times New Roman" w:hAnsi="Times New Roman"/>
+          <w:b/>
+          <w:i/>
+          <w:sz w:val="24"/>
+          <w:szCs w:val="24"/>
+        </w:rPr>
+        <w:tab/>
+      </w:r>
+      <w:r>
+        <w:rPr>
+          <w:rFonts w:ascii="Times New Roman" w:hAnsi="Times New Roman"/>
+          <w:b/>
+          <w:i/>
+          <w:sz w:val="24"/>
+          <w:szCs w:val="24"/>
+        </w:rPr>
+        <w:tab/>
+      </w:r>
+      <w:r>
+        <w:rPr>
+          <w:rFonts w:ascii="Times New Roman" w:hAnsi="Times New Roman"/>
+          <w:b/>
+          <w:i/>
+          <w:sz w:val="24"/>
+          <w:szCs w:val="24"/>
+        </w:rPr>
+        <w:tab/>
+      </w:r>
+      <w:r>
+        <w:rPr>
+          <w:rFonts w:ascii="Times New Roman" w:hAnsi="Times New Roman"/>
+          <w:b/>
+          <w:i/>
+          <w:sz w:val="24"/>
+          <w:szCs w:val="24"/>
+        </w:rPr>
+        <w:tab/>
+      </w:r>
+      <w:r>
+        <w:rPr>
+          <w:rFonts w:ascii="Times New Roman" w:hAnsi="Times New Roman"/>
+          <w:b/>
+          <w:i/>
+          <w:sz w:val="24"/>
+          <w:szCs w:val="24"/>
+        </w:rPr>
+        <w:tab/>
+      </w:r>
+      <w:r>
+        <w:rPr>
+          <w:rFonts w:ascii="Times New Roman" w:hAnsi="Times New Roman"/>
+          <w:b/>
+          <w:i/>
+          <w:sz w:val="24"/>
+          <w:szCs w:val="24"/>
+        </w:rPr>
+        <w:tab/>
+      </w:r>
+      <w:r>
+        <w:rPr>
+          <w:rFonts w:ascii="Times New Roman" w:hAnsi="Times New Roman"/>
+          <w:sz w:val="24"/>
+          <w:szCs w:val="24"/>
+          <w:lang w:val="de-DE"/>
+        </w:rPr>
+        <w:t>10</w:t>
+      </w:r>
+      <w:r>
+        <w:rPr>
+          <w:rFonts w:ascii="Times New Roman" w:hAnsi="Times New Roman"/>
+          <w:sz w:val="24"/>
+          <w:szCs w:val="24"/>
+          <w:lang w:val="de-DE"/>
+        </w:rPr>
+        <w:t xml:space="preserve">. Ghi chú:  </w:t>
       </w:r>
     </w:p>
     <w:p>
@@ -675,7 +872,6 @@
                 <w:szCs w:val="24"/>
               </w:rPr>
             </w:pPr>
-            <w:proofErr w:type="spellStart"/>
             <w:r>
               <w:rPr>
                 <w:rFonts w:ascii="Times New Roman" w:hAnsi="Times New Roman"/>
@@ -683,37 +879,7 @@
                 <w:sz w:val="24"/>
                 <w:szCs w:val="24"/>
               </w:rPr>
-              <w:t>Ngày</w:t>
-            </w:r>
-            <w:proofErr w:type="spellEnd"/>
-            <w:r>
-              <w:rPr>
-                <w:rFonts w:ascii="Times New Roman" w:hAnsi="Times New Roman"/>
-                <w:b/>
-                <w:sz w:val="24"/>
-                <w:szCs w:val="24"/>
-              </w:rPr>
-              <w:t xml:space="preserve"> </w:t>
-            </w:r>
-            <w:proofErr w:type="spellStart"/>
-            <w:r>
-              <w:rPr>
-                <w:rFonts w:ascii="Times New Roman" w:hAnsi="Times New Roman"/>
-                <w:b/>
-                <w:sz w:val="24"/>
-                <w:szCs w:val="24"/>
-              </w:rPr>
-              <w:t>nhập</w:t>
-            </w:r>
-            <w:proofErr w:type="spellEnd"/>
-            <w:r>
-              <w:rPr>
-                <w:rFonts w:ascii="Times New Roman" w:hAnsi="Times New Roman"/>
-                <w:b/>
-                <w:sz w:val="24"/>
-                <w:szCs w:val="24"/>
-              </w:rPr>
-              <w:t xml:space="preserve"> </w:t>
+              <w:t xml:space="preserve">Ngày nhập </w:t>
             </w:r>
           </w:p>
           <w:p>
@@ -766,7 +932,6 @@
                 <w:szCs w:val="24"/>
               </w:rPr>
             </w:pPr>
-            <w:proofErr w:type="spellStart"/>
             <w:r>
               <w:rPr>
                 <w:rFonts w:ascii="Times New Roman" w:hAnsi="Times New Roman"/>
@@ -774,9 +939,28 @@
                 <w:sz w:val="24"/>
                 <w:szCs w:val="24"/>
               </w:rPr>
-              <w:t>Kiểm</w:t>
+              <w:t>Kiểm tra ngoại quan</w:t>
             </w:r>
-            <w:proofErr w:type="spellEnd"/>
+          </w:p>
+        </w:tc>
+        <w:tc>
+          <w:tcPr>
+            <w:tcW w:w="958" w:type="dxa"/>
+            <w:tcBorders>
+              <w:bottom w:val="single" w:sz="4" w:space="0" w:color="auto"/>
+            </w:tcBorders>
+            <w:vAlign w:val="center"/>
+          </w:tcPr>
+          <w:p>
+            <w:pPr>
+              <w:jc w:val="center"/>
+              <w:rPr>
+                <w:rFonts w:ascii="Times New Roman" w:hAnsi="Times New Roman"/>
+                <w:b/>
+                <w:sz w:val="24"/>
+                <w:szCs w:val="24"/>
+              </w:rPr>
+            </w:pPr>
             <w:r>
               <w:rPr>
                 <w:rFonts w:ascii="Times New Roman" w:hAnsi="Times New Roman"/>
@@ -784,150 +968,8 @@
                 <w:sz w:val="24"/>
                 <w:szCs w:val="24"/>
               </w:rPr>
-              <w:t xml:space="preserve"> </w:t>
+              <w:t>Định lượng đầu vào</w:t>
             </w:r>
-            <w:proofErr w:type="spellStart"/>
-            <w:r>
-              <w:rPr>
-                <w:rFonts w:ascii="Times New Roman" w:hAnsi="Times New Roman"/>
-                <w:b/>
-                <w:sz w:val="24"/>
-                <w:szCs w:val="24"/>
-              </w:rPr>
-              <w:t>tra</w:t>
-            </w:r>
-            <w:proofErr w:type="spellEnd"/>
-            <w:r>
-              <w:rPr>
-                <w:rFonts w:ascii="Times New Roman" w:hAnsi="Times New Roman"/>
-                <w:b/>
-                <w:sz w:val="24"/>
-                <w:szCs w:val="24"/>
-              </w:rPr>
-              <w:t xml:space="preserve"> </w:t>
-            </w:r>
-            <w:proofErr w:type="spellStart"/>
-            <w:r>
-              <w:rPr>
-                <w:rFonts w:ascii="Times New Roman" w:hAnsi="Times New Roman"/>
-                <w:b/>
-                <w:sz w:val="24"/>
-                <w:szCs w:val="24"/>
-              </w:rPr>
-              <w:t>ngoại</w:t>
-            </w:r>
-            <w:proofErr w:type="spellEnd"/>
-            <w:r>
-              <w:rPr>
-                <w:rFonts w:ascii="Times New Roman" w:hAnsi="Times New Roman"/>
-                <w:b/>
-                <w:sz w:val="24"/>
-                <w:szCs w:val="24"/>
-              </w:rPr>
-              <w:t xml:space="preserve"> </w:t>
-            </w:r>
-            <w:proofErr w:type="spellStart"/>
-            <w:r>
-              <w:rPr>
-                <w:rFonts w:ascii="Times New Roman" w:hAnsi="Times New Roman"/>
-                <w:b/>
-                <w:sz w:val="24"/>
-                <w:szCs w:val="24"/>
-              </w:rPr>
-              <w:t>quan</w:t>
-            </w:r>
-            <w:proofErr w:type="spellEnd"/>
-          </w:p>
-        </w:tc>
-        <w:tc>
-          <w:tcPr>
-            <w:tcW w:w="958" w:type="dxa"/>
-            <w:tcBorders>
-              <w:bottom w:val="single" w:sz="4" w:space="0" w:color="auto"/>
-            </w:tcBorders>
-            <w:vAlign w:val="center"/>
-          </w:tcPr>
-          <w:p>
-            <w:pPr>
-              <w:jc w:val="center"/>
-              <w:rPr>
-                <w:rFonts w:ascii="Times New Roman" w:hAnsi="Times New Roman"/>
-                <w:b/>
-                <w:sz w:val="24"/>
-                <w:szCs w:val="24"/>
-              </w:rPr>
-            </w:pPr>
-            <w:proofErr w:type="spellStart"/>
-            <w:r>
-              <w:rPr>
-                <w:rFonts w:ascii="Times New Roman" w:hAnsi="Times New Roman"/>
-                <w:b/>
-                <w:sz w:val="24"/>
-                <w:szCs w:val="24"/>
-              </w:rPr>
-              <w:t>Định</w:t>
-            </w:r>
-            <w:proofErr w:type="spellEnd"/>
-            <w:r>
-              <w:rPr>
-                <w:rFonts w:ascii="Times New Roman" w:hAnsi="Times New Roman"/>
-                <w:b/>
-                <w:sz w:val="24"/>
-                <w:szCs w:val="24"/>
-              </w:rPr>
-              <w:t xml:space="preserve"> </w:t>
-            </w:r>
-            <w:proofErr w:type="spellStart"/>
-            <w:r>
-              <w:rPr>
-                <w:rFonts w:ascii="Times New Roman" w:hAnsi="Times New Roman"/>
-                <w:b/>
-                <w:sz w:val="24"/>
-                <w:szCs w:val="24"/>
-              </w:rPr>
-              <w:t>lượng</w:t>
-            </w:r>
-            <w:proofErr w:type="spellEnd"/>
-            <w:r>
-              <w:rPr>
-                <w:rFonts w:ascii="Times New Roman" w:hAnsi="Times New Roman"/>
-                <w:b/>
-                <w:sz w:val="24"/>
-                <w:szCs w:val="24"/>
-              </w:rPr>
-              <w:t xml:space="preserve"> </w:t>
-            </w:r>
-            <w:proofErr w:type="spellStart"/>
-            <w:r>
-              <w:rPr>
-                <w:rFonts w:ascii="Times New Roman" w:hAnsi="Times New Roman"/>
-                <w:b/>
-                <w:sz w:val="24"/>
-                <w:szCs w:val="24"/>
-              </w:rPr>
-              <w:t>đầu</w:t>
-            </w:r>
-            <w:proofErr w:type="spellEnd"/>
-            <w:r>
-              <w:rPr>
-                <w:rFonts w:ascii="Times New Roman" w:hAnsi="Times New Roman"/>
-                <w:b/>
-                <w:sz w:val="24"/>
-                <w:szCs w:val="24"/>
-              </w:rPr>
-              <w:t xml:space="preserve"> </w:t>
-            </w:r>
-            <w:proofErr w:type="spellStart"/>
-            <w:r>
-              <w:rPr>
-                <w:rFonts w:ascii="Times New Roman" w:hAnsi="Times New Roman"/>
-                <w:b/>
-                <w:sz w:val="24"/>
-                <w:szCs w:val="24"/>
-              </w:rPr>
-              <w:t>vào</w:t>
-            </w:r>
-            <w:proofErr w:type="spellEnd"/>
           </w:p>
           <w:p>
             <w:pPr>
@@ -969,7 +1011,6 @@
                 <w:szCs w:val="24"/>
               </w:rPr>
             </w:pPr>
-            <w:proofErr w:type="spellStart"/>
             <w:r>
               <w:rPr>
                 <w:rFonts w:ascii="Times New Roman" w:hAnsi="Times New Roman"/>
@@ -977,69 +1018,8 @@
                 <w:sz w:val="24"/>
                 <w:szCs w:val="24"/>
               </w:rPr>
-              <w:t>Khối</w:t>
+              <w:t>Khối lượng trên quả</w:t>
             </w:r>
-            <w:proofErr w:type="spellEnd"/>
-            <w:r>
-              <w:rPr>
-                <w:rFonts w:ascii="Times New Roman" w:hAnsi="Times New Roman"/>
-                <w:b/>
-                <w:sz w:val="24"/>
-                <w:szCs w:val="24"/>
-              </w:rPr>
-              <w:t xml:space="preserve"> </w:t>
-            </w:r>
-            <w:proofErr w:type="spellStart"/>
-            <w:r>
-              <w:rPr>
-                <w:rFonts w:ascii="Times New Roman" w:hAnsi="Times New Roman"/>
-                <w:b/>
-                <w:sz w:val="24"/>
-                <w:szCs w:val="24"/>
-              </w:rPr>
-              <w:t>lượng</w:t>
-            </w:r>
-            <w:proofErr w:type="spellEnd"/>
-            <w:r>
-              <w:rPr>
-                <w:rFonts w:ascii="Times New Roman" w:hAnsi="Times New Roman"/>
-                <w:b/>
-                <w:sz w:val="24"/>
-                <w:szCs w:val="24"/>
-              </w:rPr>
-              <w:t xml:space="preserve"> </w:t>
-            </w:r>
-            <w:proofErr w:type="spellStart"/>
-            <w:r>
-              <w:rPr>
-                <w:rFonts w:ascii="Times New Roman" w:hAnsi="Times New Roman"/>
-                <w:b/>
-                <w:sz w:val="24"/>
-                <w:szCs w:val="24"/>
-              </w:rPr>
-              <w:t>trên</w:t>
-            </w:r>
-            <w:proofErr w:type="spellEnd"/>
-            <w:r>
-              <w:rPr>
-                <w:rFonts w:ascii="Times New Roman" w:hAnsi="Times New Roman"/>
-                <w:b/>
-                <w:sz w:val="24"/>
-                <w:szCs w:val="24"/>
-              </w:rPr>
-              <w:t xml:space="preserve"> </w:t>
-            </w:r>
-            <w:proofErr w:type="spellStart"/>
-            <w:r>
-              <w:rPr>
-                <w:rFonts w:ascii="Times New Roman" w:hAnsi="Times New Roman"/>
-                <w:b/>
-                <w:sz w:val="24"/>
-                <w:szCs w:val="24"/>
-              </w:rPr>
-              <w:t>quả</w:t>
-            </w:r>
-            <w:proofErr w:type="spellEnd"/>
           </w:p>
           <w:p>
             <w:pPr>
@@ -1089,7 +1069,6 @@
                 <w:szCs w:val="24"/>
               </w:rPr>
             </w:pPr>
-            <w:proofErr w:type="spellStart"/>
             <w:r>
               <w:rPr>
                 <w:rFonts w:ascii="Times New Roman" w:hAnsi="Times New Roman"/>
@@ -1097,69 +1076,8 @@
                 <w:sz w:val="24"/>
                 <w:szCs w:val="24"/>
               </w:rPr>
-              <w:t>Khối</w:t>
+              <w:t>Khối lượng cân lại</w:t>
             </w:r>
-            <w:proofErr w:type="spellEnd"/>
-            <w:r>
-              <w:rPr>
-                <w:rFonts w:ascii="Times New Roman" w:hAnsi="Times New Roman"/>
-                <w:b/>
-                <w:sz w:val="24"/>
-                <w:szCs w:val="24"/>
-              </w:rPr>
-              <w:t xml:space="preserve"> </w:t>
-            </w:r>
-            <w:proofErr w:type="spellStart"/>
-            <w:r>
-              <w:rPr>
-                <w:rFonts w:ascii="Times New Roman" w:hAnsi="Times New Roman"/>
-                <w:b/>
-                <w:sz w:val="24"/>
-                <w:szCs w:val="24"/>
-              </w:rPr>
-              <w:t>lượng</w:t>
-            </w:r>
-            <w:proofErr w:type="spellEnd"/>
-            <w:r>
-              <w:rPr>
-                <w:rFonts w:ascii="Times New Roman" w:hAnsi="Times New Roman"/>
-                <w:b/>
-                <w:sz w:val="24"/>
-                <w:szCs w:val="24"/>
-              </w:rPr>
-              <w:t xml:space="preserve"> </w:t>
-            </w:r>
-            <w:proofErr w:type="spellStart"/>
-            <w:r>
-              <w:rPr>
-                <w:rFonts w:ascii="Times New Roman" w:hAnsi="Times New Roman"/>
-                <w:b/>
-                <w:sz w:val="24"/>
-                <w:szCs w:val="24"/>
-              </w:rPr>
-              <w:t>cân</w:t>
-            </w:r>
-            <w:proofErr w:type="spellEnd"/>
-            <w:r>
-              <w:rPr>
-                <w:rFonts w:ascii="Times New Roman" w:hAnsi="Times New Roman"/>
-                <w:b/>
-                <w:sz w:val="24"/>
-                <w:szCs w:val="24"/>
-              </w:rPr>
-              <w:t xml:space="preserve"> </w:t>
-            </w:r>
-            <w:proofErr w:type="spellStart"/>
-            <w:r>
-              <w:rPr>
-                <w:rFonts w:ascii="Times New Roman" w:hAnsi="Times New Roman"/>
-                <w:b/>
-                <w:sz w:val="24"/>
-                <w:szCs w:val="24"/>
-              </w:rPr>
-              <w:t>lại</w:t>
-            </w:r>
-            <w:proofErr w:type="spellEnd"/>
           </w:p>
           <w:p>
             <w:pPr>
@@ -1209,7 +1127,6 @@
                 <w:szCs w:val="24"/>
               </w:rPr>
             </w:pPr>
-            <w:proofErr w:type="spellStart"/>
             <w:r>
               <w:rPr>
                 <w:rFonts w:ascii="Times New Roman" w:hAnsi="Times New Roman"/>
@@ -1217,57 +1134,7 @@
                 <w:sz w:val="24"/>
                 <w:szCs w:val="24"/>
               </w:rPr>
-              <w:t>Rách</w:t>
-            </w:r>
-            <w:proofErr w:type="spellEnd"/>
-            <w:r>
-              <w:rPr>
-                <w:rFonts w:ascii="Times New Roman" w:hAnsi="Times New Roman"/>
-                <w:b/>
-                <w:sz w:val="24"/>
-                <w:szCs w:val="24"/>
-              </w:rPr>
-              <w:t xml:space="preserve"> </w:t>
-            </w:r>
-            <w:proofErr w:type="spellStart"/>
-            <w:r>
-              <w:rPr>
-                <w:rFonts w:ascii="Times New Roman" w:hAnsi="Times New Roman"/>
-                <w:b/>
-                <w:sz w:val="24"/>
-                <w:szCs w:val="24"/>
-              </w:rPr>
-              <w:t>sản</w:t>
-            </w:r>
-            <w:proofErr w:type="spellEnd"/>
-            <w:r>
-              <w:rPr>
-                <w:rFonts w:ascii="Times New Roman" w:hAnsi="Times New Roman"/>
-                <w:b/>
-                <w:sz w:val="24"/>
-                <w:szCs w:val="24"/>
-              </w:rPr>
-              <w:t xml:space="preserve"> </w:t>
-            </w:r>
-            <w:proofErr w:type="spellStart"/>
-            <w:r>
-              <w:rPr>
-                <w:rFonts w:ascii="Times New Roman" w:hAnsi="Times New Roman"/>
-                <w:b/>
-                <w:sz w:val="24"/>
-                <w:szCs w:val="24"/>
-              </w:rPr>
-              <w:t>xuất</w:t>
-            </w:r>
-            <w:proofErr w:type="spellEnd"/>
-            <w:r>
-              <w:rPr>
-                <w:rFonts w:ascii="Times New Roman" w:hAnsi="Times New Roman"/>
-                <w:b/>
-                <w:sz w:val="24"/>
-                <w:szCs w:val="24"/>
-              </w:rPr>
-              <w:t xml:space="preserve"> </w:t>
+              <w:t xml:space="preserve">Rách sản xuất </w:t>
             </w:r>
           </w:p>
           <w:p>
@@ -1318,7 +1185,6 @@
                 <w:szCs w:val="24"/>
               </w:rPr>
             </w:pPr>
-            <w:proofErr w:type="spellStart"/>
             <w:r>
               <w:rPr>
                 <w:rFonts w:ascii="Times New Roman" w:hAnsi="Times New Roman"/>
@@ -1326,29 +1192,8 @@
                 <w:sz w:val="24"/>
                 <w:szCs w:val="24"/>
               </w:rPr>
-              <w:t>Rách</w:t>
+              <w:t>Rách trước</w:t>
             </w:r>
-            <w:proofErr w:type="spellEnd"/>
-            <w:r>
-              <w:rPr>
-                <w:rFonts w:ascii="Times New Roman" w:hAnsi="Times New Roman"/>
-                <w:b/>
-                <w:sz w:val="24"/>
-                <w:szCs w:val="24"/>
-              </w:rPr>
-              <w:t xml:space="preserve"> </w:t>
-            </w:r>
-            <w:proofErr w:type="spellStart"/>
-            <w:r>
-              <w:rPr>
-                <w:rFonts w:ascii="Times New Roman" w:hAnsi="Times New Roman"/>
-                <w:b/>
-                <w:sz w:val="24"/>
-                <w:szCs w:val="24"/>
-              </w:rPr>
-              <w:t>trước</w:t>
-            </w:r>
-            <w:proofErr w:type="spellEnd"/>
           </w:p>
           <w:p>
             <w:pPr>
@@ -1398,7 +1243,6 @@
                 <w:szCs w:val="24"/>
               </w:rPr>
             </w:pPr>
-            <w:proofErr w:type="spellStart"/>
             <w:r>
               <w:rPr>
                 <w:rFonts w:ascii="Times New Roman" w:hAnsi="Times New Roman"/>
@@ -1408,7 +1252,6 @@
               </w:rPr>
               <w:t>Vỏ+lõi</w:t>
             </w:r>
-            <w:proofErr w:type="spellEnd"/>
           </w:p>
           <w:p>
             <w:pPr>
@@ -1458,7 +1301,6 @@
                 <w:szCs w:val="24"/>
               </w:rPr>
             </w:pPr>
-            <w:proofErr w:type="spellStart"/>
             <w:r>
               <w:rPr>
                 <w:rFonts w:ascii="Times New Roman" w:hAnsi="Times New Roman"/>
@@ -1466,69 +1308,8 @@
                 <w:sz w:val="24"/>
                 <w:szCs w:val="24"/>
               </w:rPr>
-              <w:t>Thành</w:t>
+              <w:t>Thành phẩm thực tế</w:t>
             </w:r>
-            <w:proofErr w:type="spellEnd"/>
-            <w:r>
-              <w:rPr>
-                <w:rFonts w:ascii="Times New Roman" w:hAnsi="Times New Roman"/>
-                <w:b/>
-                <w:sz w:val="24"/>
-                <w:szCs w:val="24"/>
-              </w:rPr>
-              <w:t xml:space="preserve"> </w:t>
-            </w:r>
-            <w:proofErr w:type="spellStart"/>
-            <w:r>
-              <w:rPr>
-                <w:rFonts w:ascii="Times New Roman" w:hAnsi="Times New Roman"/>
-                <w:b/>
-                <w:sz w:val="24"/>
-                <w:szCs w:val="24"/>
-              </w:rPr>
-              <w:t>phẩm</w:t>
-            </w:r>
-            <w:proofErr w:type="spellEnd"/>
-            <w:r>
-              <w:rPr>
-                <w:rFonts w:ascii="Times New Roman" w:hAnsi="Times New Roman"/>
-                <w:b/>
-                <w:sz w:val="24"/>
-                <w:szCs w:val="24"/>
-              </w:rPr>
-              <w:t xml:space="preserve"> </w:t>
-            </w:r>
-            <w:proofErr w:type="spellStart"/>
-            <w:r>
-              <w:rPr>
-                <w:rFonts w:ascii="Times New Roman" w:hAnsi="Times New Roman"/>
-                <w:b/>
-                <w:sz w:val="24"/>
-                <w:szCs w:val="24"/>
-              </w:rPr>
-              <w:t>thực</w:t>
-            </w:r>
-            <w:proofErr w:type="spellEnd"/>
-            <w:r>
-              <w:rPr>
-                <w:rFonts w:ascii="Times New Roman" w:hAnsi="Times New Roman"/>
-                <w:b/>
-                <w:sz w:val="24"/>
-                <w:szCs w:val="24"/>
-              </w:rPr>
-              <w:t xml:space="preserve"> </w:t>
-            </w:r>
-            <w:proofErr w:type="spellStart"/>
-            <w:r>
-              <w:rPr>
-                <w:rFonts w:ascii="Times New Roman" w:hAnsi="Times New Roman"/>
-                <w:b/>
-                <w:sz w:val="24"/>
-                <w:szCs w:val="24"/>
-              </w:rPr>
-              <w:t>tế</w:t>
-            </w:r>
-            <w:proofErr w:type="spellEnd"/>
           </w:p>
           <w:p>
             <w:pPr>
@@ -1578,7 +1359,6 @@
                 <w:szCs w:val="24"/>
               </w:rPr>
             </w:pPr>
-            <w:proofErr w:type="spellStart"/>
             <w:r>
               <w:rPr>
                 <w:rFonts w:ascii="Times New Roman" w:hAnsi="Times New Roman"/>
@@ -1586,69 +1366,8 @@
                 <w:sz w:val="24"/>
                 <w:szCs w:val="24"/>
               </w:rPr>
-              <w:t>Định</w:t>
+              <w:t>Định lượng kiểm tra</w:t>
             </w:r>
-            <w:proofErr w:type="spellEnd"/>
-            <w:r>
-              <w:rPr>
-                <w:rFonts w:ascii="Times New Roman" w:hAnsi="Times New Roman"/>
-                <w:b/>
-                <w:sz w:val="24"/>
-                <w:szCs w:val="24"/>
-              </w:rPr>
-              <w:t xml:space="preserve"> </w:t>
-            </w:r>
-            <w:proofErr w:type="spellStart"/>
-            <w:r>
-              <w:rPr>
-                <w:rFonts w:ascii="Times New Roman" w:hAnsi="Times New Roman"/>
-                <w:b/>
-                <w:sz w:val="24"/>
-                <w:szCs w:val="24"/>
-              </w:rPr>
-              <w:t>lượng</w:t>
-            </w:r>
-            <w:proofErr w:type="spellEnd"/>
-            <w:r>
-              <w:rPr>
-                <w:rFonts w:ascii="Times New Roman" w:hAnsi="Times New Roman"/>
-                <w:b/>
-                <w:sz w:val="24"/>
-                <w:szCs w:val="24"/>
-              </w:rPr>
-              <w:t xml:space="preserve"> </w:t>
-            </w:r>
-            <w:proofErr w:type="spellStart"/>
-            <w:r>
-              <w:rPr>
-                <w:rFonts w:ascii="Times New Roman" w:hAnsi="Times New Roman"/>
-                <w:b/>
-                <w:sz w:val="24"/>
-                <w:szCs w:val="24"/>
-              </w:rPr>
-              <w:t>kiểm</w:t>
-            </w:r>
-            <w:proofErr w:type="spellEnd"/>
-            <w:r>
-              <w:rPr>
-                <w:rFonts w:ascii="Times New Roman" w:hAnsi="Times New Roman"/>
-                <w:b/>
-                <w:sz w:val="24"/>
-                <w:szCs w:val="24"/>
-              </w:rPr>
-              <w:t xml:space="preserve"> </w:t>
-            </w:r>
-            <w:proofErr w:type="spellStart"/>
-            <w:r>
-              <w:rPr>
-                <w:rFonts w:ascii="Times New Roman" w:hAnsi="Times New Roman"/>
-                <w:b/>
-                <w:sz w:val="24"/>
-                <w:szCs w:val="24"/>
-              </w:rPr>
-              <w:t>tra</w:t>
-            </w:r>
-            <w:proofErr w:type="spellEnd"/>
           </w:p>
           <w:p>
             <w:pPr>
@@ -1699,7 +1418,6 @@
                 <w:szCs w:val="24"/>
               </w:rPr>
             </w:pPr>
-            <w:proofErr w:type="spellStart"/>
             <w:r>
               <w:rPr>
                 <w:rFonts w:ascii="Times New Roman" w:hAnsi="Times New Roman"/>
@@ -1707,29 +1425,8 @@
                 <w:sz w:val="24"/>
                 <w:szCs w:val="24"/>
               </w:rPr>
-              <w:t>Người</w:t>
+              <w:t>Người xả</w:t>
             </w:r>
-            <w:proofErr w:type="spellEnd"/>
-            <w:r>
-              <w:rPr>
-                <w:rFonts w:ascii="Times New Roman" w:hAnsi="Times New Roman"/>
-                <w:b/>
-                <w:sz w:val="24"/>
-                <w:szCs w:val="24"/>
-              </w:rPr>
-              <w:t xml:space="preserve"> </w:t>
-            </w:r>
-            <w:proofErr w:type="spellStart"/>
-            <w:r>
-              <w:rPr>
-                <w:rFonts w:ascii="Times New Roman" w:hAnsi="Times New Roman"/>
-                <w:b/>
-                <w:sz w:val="24"/>
-                <w:szCs w:val="24"/>
-              </w:rPr>
-              <w:t>xả</w:t>
-            </w:r>
-            <w:proofErr w:type="spellEnd"/>
           </w:p>
           <w:p>
             <w:pPr>
@@ -4059,59 +3756,8 @@
                 <w:i/>
                 <w:lang w:eastAsia="x-none"/>
               </w:rPr>
-              <w:t xml:space="preserve">                       </w:t>
+              <w:t xml:space="preserve">                       Ngày        tháng       năm</w:t>
             </w:r>
-            <w:proofErr w:type="spellStart"/>
-            <w:r>
-              <w:rPr>
-                <w:rFonts w:ascii="Times New Roman" w:hAnsi="Times New Roman"/>
-                <w:b/>
-                <w:i/>
-                <w:lang w:eastAsia="x-none"/>
-              </w:rPr>
-              <w:t>Ngày</w:t>
-            </w:r>
-            <w:proofErr w:type="spellEnd"/>
-            <w:r>
-              <w:rPr>
-                <w:rFonts w:ascii="Times New Roman" w:hAnsi="Times New Roman"/>
-                <w:b/>
-                <w:i/>
-                <w:lang w:eastAsia="x-none"/>
-              </w:rPr>
-              <w:t xml:space="preserve">        </w:t>
-            </w:r>
-            <w:proofErr w:type="spellStart"/>
-            <w:r>
-              <w:rPr>
-                <w:rFonts w:ascii="Times New Roman" w:hAnsi="Times New Roman"/>
-                <w:b/>
-                <w:i/>
-                <w:lang w:eastAsia="x-none"/>
-              </w:rPr>
-              <w:t>tháng</w:t>
-            </w:r>
-            <w:proofErr w:type="spellEnd"/>
-            <w:r>
-              <w:rPr>
-                <w:rFonts w:ascii="Times New Roman" w:hAnsi="Times New Roman"/>
-                <w:b/>
-                <w:i/>
-                <w:lang w:eastAsia="x-none"/>
-              </w:rPr>
-              <w:t xml:space="preserve">       </w:t>
-            </w:r>
-            <w:proofErr w:type="spellStart"/>
-            <w:r>
-              <w:rPr>
-                <w:rFonts w:ascii="Times New Roman" w:hAnsi="Times New Roman"/>
-                <w:b/>
-                <w:i/>
-                <w:lang w:eastAsia="x-none"/>
-              </w:rPr>
-              <w:t>năm</w:t>
-            </w:r>
-            <w:proofErr w:type="spellEnd"/>
           </w:p>
         </w:tc>
       </w:tr>
@@ -4396,7 +4042,6 @@
       <w:pStyle w:val="Footer"/>
       <w:jc w:val="center"/>
     </w:pPr>
-    <w:proofErr w:type="spellStart"/>
     <w:r>
       <w:rPr>
         <w:rFonts w:ascii="Times New Roman" w:hAnsi="Times New Roman"/>
@@ -4404,9 +4049,8 @@
         <w:sz w:val="24"/>
         <w:lang w:val="en-US"/>
       </w:rPr>
-      <w:t>Habeco</w:t>
+      <w:t xml:space="preserve">Habeco-P      </w:t>
     </w:r>
-    <w:proofErr w:type="spellEnd"/>
     <w:r>
       <w:rPr>
         <w:rFonts w:ascii="Times New Roman" w:hAnsi="Times New Roman"/>
@@ -4414,7 +4058,7 @@
         <w:sz w:val="24"/>
         <w:lang w:val="en-US"/>
       </w:rPr>
-      <w:t xml:space="preserve">-P      </w:t>
+      <w:t xml:space="preserve">       </w:t>
     </w:r>
     <w:r>
       <w:rPr>
@@ -4423,7 +4067,7 @@
         <w:sz w:val="24"/>
         <w:lang w:val="en-US"/>
       </w:rPr>
-      <w:t xml:space="preserve">       </w:t>
+      <w:t xml:space="preserve">       Mã hiệu:</w:t>
     </w:r>
     <w:r>
       <w:rPr>
@@ -4432,9 +4076,8 @@
         <w:sz w:val="24"/>
         <w:lang w:val="en-US"/>
       </w:rPr>
-      <w:t xml:space="preserve">       </w:t>
+      <w:t>QT.0</w:t>
     </w:r>
-    <w:proofErr w:type="spellStart"/>
     <w:r>
       <w:rPr>
         <w:rFonts w:ascii="Times New Roman" w:hAnsi="Times New Roman"/>
@@ -4442,9 +4085,8 @@
         <w:sz w:val="24"/>
         <w:lang w:val="en-US"/>
       </w:rPr>
-      <w:t>Mã</w:t>
+      <w:t>1</w:t>
     </w:r>
-    <w:proofErr w:type="spellEnd"/>
     <w:r>
       <w:rPr>
         <w:rFonts w:ascii="Times New Roman" w:hAnsi="Times New Roman"/>
@@ -4452,7 +4094,7 @@
         <w:sz w:val="24"/>
         <w:lang w:val="en-US"/>
       </w:rPr>
-      <w:t xml:space="preserve"> hiệu:</w:t>
+      <w:t>/</w:t>
     </w:r>
     <w:r>
       <w:rPr>
@@ -4461,7 +4103,7 @@
         <w:sz w:val="24"/>
         <w:lang w:val="en-US"/>
       </w:rPr>
-      <w:t>QT.0</w:t>
+      <w:t>HABECO-P-01</w:t>
     </w:r>
     <w:r>
       <w:rPr>
@@ -4470,7 +4112,7 @@
         <w:sz w:val="24"/>
         <w:lang w:val="en-US"/>
       </w:rPr>
-      <w:t>1</w:t>
+      <w:t xml:space="preserve">    </w:t>
     </w:r>
     <w:r>
       <w:rPr>
@@ -4479,7 +4121,7 @@
         <w:sz w:val="24"/>
         <w:lang w:val="en-US"/>
       </w:rPr>
-      <w:t>/</w:t>
+      <w:t xml:space="preserve">               </w:t>
     </w:r>
     <w:r>
       <w:rPr>
@@ -4488,7 +4130,15 @@
         <w:sz w:val="24"/>
         <w:lang w:val="en-US"/>
       </w:rPr>
-      <w:t>HABECO-P-01</w:t>
+      <w:t xml:space="preserve">      </w:t>
+    </w:r>
+    <w:r>
+      <w:rPr>
+        <w:rFonts w:ascii="Times New Roman" w:hAnsi="Times New Roman"/>
+        <w:i/>
+        <w:sz w:val="24"/>
+      </w:rPr>
+      <w:t>Số ban hành:</w:t>
     </w:r>
     <w:r>
       <w:rPr>
@@ -4497,7 +4147,7 @@
         <w:sz w:val="24"/>
         <w:lang w:val="en-US"/>
       </w:rPr>
-      <w:t xml:space="preserve">    </w:t>
+      <w:t xml:space="preserve">   </w:t>
     </w:r>
     <w:r>
       <w:rPr>
@@ -4506,7 +4156,7 @@
         <w:sz w:val="24"/>
         <w:lang w:val="en-US"/>
       </w:rPr>
-      <w:t xml:space="preserve">               </w:t>
+      <w:t xml:space="preserve">  </w:t>
     </w:r>
     <w:r>
       <w:rPr>
@@ -4515,43 +4165,7 @@
         <w:sz w:val="24"/>
         <w:lang w:val="en-US"/>
       </w:rPr>
-      <w:t xml:space="preserve">      </w:t>
-    </w:r>
-    <w:proofErr w:type="spellStart"/>
-    <w:r>
-      <w:rPr>
-        <w:rFonts w:ascii="Times New Roman" w:hAnsi="Times New Roman"/>
-        <w:i/>
-        <w:sz w:val="24"/>
-      </w:rPr>
-      <w:t>Số</w:t>
-    </w:r>
-    <w:proofErr w:type="spellEnd"/>
-    <w:r>
-      <w:rPr>
-        <w:rFonts w:ascii="Times New Roman" w:hAnsi="Times New Roman"/>
-        <w:i/>
-        <w:sz w:val="24"/>
-      </w:rPr>
-      <w:t xml:space="preserve"> ban </w:t>
-    </w:r>
-    <w:proofErr w:type="spellStart"/>
-    <w:r>
-      <w:rPr>
-        <w:rFonts w:ascii="Times New Roman" w:hAnsi="Times New Roman"/>
-        <w:i/>
-        <w:sz w:val="24"/>
-      </w:rPr>
-      <w:t>hành</w:t>
-    </w:r>
-    <w:proofErr w:type="spellEnd"/>
-    <w:r>
-      <w:rPr>
-        <w:rFonts w:ascii="Times New Roman" w:hAnsi="Times New Roman"/>
-        <w:i/>
-        <w:sz w:val="24"/>
-      </w:rPr>
-      <w:t>:</w:t>
+      <w:t>4</w:t>
     </w:r>
     <w:r>
       <w:rPr>
@@ -4560,7 +4174,7 @@
         <w:sz w:val="24"/>
         <w:lang w:val="en-US"/>
       </w:rPr>
-      <w:t xml:space="preserve">   </w:t>
+      <w:t xml:space="preserve"> / </w:t>
     </w:r>
     <w:r>
       <w:rPr>
@@ -4569,7 +4183,7 @@
         <w:sz w:val="24"/>
         <w:lang w:val="en-US"/>
       </w:rPr>
-      <w:t xml:space="preserve">  </w:t>
+      <w:t>0</w:t>
     </w:r>
     <w:r>
       <w:rPr>
@@ -4578,7 +4192,15 @@
         <w:sz w:val="24"/>
         <w:lang w:val="en-US"/>
       </w:rPr>
-      <w:t>4</w:t>
+      <w:t xml:space="preserve">   </w:t>
+    </w:r>
+    <w:r>
+      <w:rPr>
+        <w:rFonts w:ascii="Times New Roman" w:hAnsi="Times New Roman"/>
+        <w:i/>
+        <w:sz w:val="24"/>
+      </w:rPr>
+      <w:t xml:space="preserve">           </w:t>
     </w:r>
     <w:r>
       <w:rPr>
@@ -4587,68 +4209,15 @@
         <w:sz w:val="24"/>
         <w:lang w:val="en-US"/>
       </w:rPr>
-      <w:t xml:space="preserve"> / </w:t>
+      <w:t xml:space="preserve">   </w:t>
     </w:r>
     <w:r>
       <w:rPr>
         <w:rFonts w:ascii="Times New Roman" w:hAnsi="Times New Roman"/>
         <w:i/>
         <w:sz w:val="24"/>
-        <w:lang w:val="en-US"/>
-      </w:rPr>
-      <w:t>0</w:t>
-    </w:r>
-    <w:r>
-      <w:rPr>
-        <w:rFonts w:ascii="Times New Roman" w:hAnsi="Times New Roman"/>
-        <w:i/>
-        <w:sz w:val="24"/>
-        <w:lang w:val="en-US"/>
-      </w:rPr>
-      <w:t xml:space="preserve">   </w:t>
-    </w:r>
-    <w:r>
-      <w:rPr>
-        <w:rFonts w:ascii="Times New Roman" w:hAnsi="Times New Roman"/>
-        <w:i/>
-        <w:sz w:val="24"/>
-      </w:rPr>
-      <w:t xml:space="preserve">           </w:t>
-    </w:r>
-    <w:r>
-      <w:rPr>
-        <w:rFonts w:ascii="Times New Roman" w:hAnsi="Times New Roman"/>
-        <w:i/>
-        <w:sz w:val="24"/>
-        <w:lang w:val="en-US"/>
-      </w:rPr>
-      <w:t xml:space="preserve">   </w:t>
-    </w:r>
-    <w:r>
-      <w:rPr>
-        <w:rFonts w:ascii="Times New Roman" w:hAnsi="Times New Roman"/>
-        <w:i/>
-        <w:sz w:val="24"/>
-      </w:rPr>
-      <w:t xml:space="preserve">   </w:t>
-    </w:r>
-    <w:proofErr w:type="spellStart"/>
-    <w:r>
-      <w:rPr>
-        <w:rFonts w:ascii="Times New Roman" w:hAnsi="Times New Roman"/>
-        <w:i/>
-        <w:sz w:val="24"/>
-      </w:rPr>
-      <w:t>Ngày</w:t>
-    </w:r>
-    <w:proofErr w:type="spellEnd"/>
-    <w:r>
-      <w:rPr>
-        <w:rFonts w:ascii="Times New Roman" w:hAnsi="Times New Roman"/>
-        <w:i/>
-        <w:sz w:val="24"/>
-      </w:rPr>
-      <w:t xml:space="preserve">     </w:t>
+      </w:rPr>
+      <w:t xml:space="preserve">   Ngày     </w:t>
     </w:r>
     <w:r>
       <w:rPr>

</xml_diff>